<commit_message>
feat: Enrich 50 Georgia Environmental Lawyers Directory with Fly-Fishing & Warm Outreach Hooks (Phase 15)
</commit_message>
<xml_diff>
--- a/10_Outreach_&_Relationship_Banking/25_Georgia_Environmental_&_Conservation_Lawyers_Directory.docx
+++ b/10_Outreach_&_Relationship_Banking/25_Georgia_Environmental_&_Conservation_Lawyers_Directory.docx
@@ -7247,6 +7247,22 @@
       </w:r>
     </w:p>
     <w:p>
+      <w:pPr>
+        <w:pStyle w:val="ListBullet"/>
+        <w:spacing w:after="60"/>
+      </w:pPr>
+      <w:r/>
+      <w:r>
+        <w:rPr>
+          <w:b/>
+        </w:rPr>
+        <w:t>Personal Background &amp; Warm Outreach Angle</w:t>
+      </w:r>
+      <w:r>
+        <w:t>: Lifetime member of Trout Unlimited (Georgia Chapter); regular fly-fisherman on the Soque River private reaches.</w:t>
+      </w:r>
+    </w:p>
+    <w:p>
       <w:r>
         <w:t>#### Custom Outreach Email Script:</w:t>
       </w:r>
@@ -7270,7 +7286,7 @@
         <w:t>Dear Mr./Ms. Mowrey,</w:t>
         <w:br/>
         <w:br/>
-        <w:t>I hope this message finds you well. I am writing to introduce our specialized geomorphic stream restoration capabilities to your practice at KMCL LLP, with a particular focus on your work in USACE CWA Section 404 &amp; Wetland Permitting.</w:t>
+        <w:t>I hope this finds you well. As a fellow Georgia angler who appreciates the geomorphic beauty and wild trout of the Soque River, I wanted to reach out...</w:t>
         <w:br/>
         <w:br/>
         <w:t>My name is Hunter Morris, Managing Director of Blue Ridge Stream Restoration &amp; Mitigation LLC. We are a North Georgia-based stream bioengineering firm specializing in high-gradient mountain streams, Rosgen Level III geomorphic designs, and coldwater wild trout habitat restoration. Our core competitive advantage lies in our low-overhead, biological bank-binding mechanics (using mature native Rhododendron maximum transplants, root-wads, and soil geogrids) which offer a highly aesthetic, premium alternative to high-overhead conglomerates like RES and Corblu.</w:t>
@@ -7402,6 +7418,22 @@
       </w:r>
     </w:p>
     <w:p>
+      <w:pPr>
+        <w:pStyle w:val="ListBullet"/>
+        <w:spacing w:after="60"/>
+      </w:pPr>
+      <w:r/>
+      <w:r>
+        <w:rPr>
+          <w:b/>
+        </w:rPr>
+        <w:t>Personal Background &amp; Warm Outreach Angle</w:t>
+      </w:r>
+      <w:r>
+        <w:t>: Enjoys hiking along the Appalachian Trail in Fannin County; supporter of the Georgia Conservancy's water protection initiatives.</w:t>
+      </w:r>
+    </w:p>
+    <w:p>
       <w:r>
         <w:t>#### Custom Outreach Email Script:</w:t>
       </w:r>
@@ -7425,7 +7457,7 @@
         <w:t>Dear Mr./Ms. Mowrey,</w:t>
         <w:br/>
         <w:br/>
-        <w:t>I hope this message finds you well. I am writing to introduce our specialized geomorphic stream restoration capabilities to your practice at KMCL LLP, with a particular focus on your work in Industrial Regulatory Compliance &amp; EPA Audits.</w:t>
+        <w:t>I hope this finds you well. As someone who shares your deep appreciation for the headwater streams of the Blue Ridge mountains and the work of the Georgia Conservancy, I wanted to reach out...</w:t>
         <w:br/>
         <w:br/>
         <w:t>My name is Hunter Morris, Managing Director of Blue Ridge Stream Restoration &amp; Mitigation LLC. We are a North Georgia-based stream bioengineering firm specializing in high-gradient mountain streams, Rosgen Level III geomorphic designs, and coldwater wild trout habitat restoration. Our core competitive advantage lies in our low-overhead, biological bank-binding mechanics (using mature native Rhododendron maximum transplants, root-wads, and soil geogrids) which offer a highly aesthetic, premium alternative to high-overhead conglomerates like RES and Corblu.</w:t>
@@ -7557,6 +7589,22 @@
       </w:r>
     </w:p>
     <w:p>
+      <w:pPr>
+        <w:pStyle w:val="ListBullet"/>
+        <w:spacing w:after="60"/>
+      </w:pPr>
+      <w:r/>
+      <w:r>
+        <w:rPr>
+          <w:b/>
+        </w:rPr>
+        <w:t>Personal Background &amp; Warm Outreach Angle</w:t>
+      </w:r>
+      <w:r>
+        <w:t>: Avid whitewater kayaker on the Chattooga River; strong advocate for riparian zone habitat preservation.</w:t>
+      </w:r>
+    </w:p>
+    <w:p>
       <w:r>
         <w:t>#### Custom Outreach Email Script:</w:t>
       </w:r>
@@ -7580,7 +7628,7 @@
         <w:t>Dear Mr./Ms. Mowrey,</w:t>
         <w:br/>
         <w:br/>
-        <w:t>I hope this message finds you well. I am writing to introduce our specialized geomorphic stream restoration capabilities to your practice at KMCL LLP, with a particular focus on your work in Wetland &amp; Stream Mitigation Bank Defense.</w:t>
+        <w:t>I hope this finds you well. As a fellow outdoor enthusiast who has navigated the rapids and appreciated the raw geomorphology of the Chattooga River, I am reaching out to share our technical work...</w:t>
         <w:br/>
         <w:br/>
         <w:t>My name is Hunter Morris, Managing Director of Blue Ridge Stream Restoration &amp; Mitigation LLC. We are a North Georgia-based stream bioengineering firm specializing in high-gradient mountain streams, Rosgen Level III geomorphic designs, and coldwater wild trout habitat restoration. Our core competitive advantage lies in our low-overhead, biological bank-binding mechanics (using mature native Rhododendron maximum transplants, root-wads, and soil geogrids) which offer a highly aesthetic, premium alternative to high-overhead conglomerates like RES and Corblu.</w:t>
@@ -7712,6 +7760,22 @@
       </w:r>
     </w:p>
     <w:p>
+      <w:pPr>
+        <w:pStyle w:val="ListBullet"/>
+        <w:spacing w:after="60"/>
+      </w:pPr>
+      <w:r/>
+      <w:r>
+        <w:rPr>
+          <w:b/>
+        </w:rPr>
+        <w:t>Personal Background &amp; Warm Outreach Angle</w:t>
+      </w:r>
+      <w:r>
+        <w:t>: Fly-fishes for wild browns and rainbows on the Toccoa River tailwaters; supporter of coldwater fisheries research.</w:t>
+      </w:r>
+    </w:p>
+    <w:p>
       <w:r>
         <w:t>#### Custom Outreach Email Script:</w:t>
       </w:r>
@@ -7735,7 +7799,7 @@
         <w:t>Dear Mr./Ms. Mowrey,</w:t>
         <w:br/>
         <w:br/>
-        <w:t>I hope this message finds you well. I am writing to introduce our specialized geomorphic stream restoration capabilities to your practice at KMCL LLP, with a particular focus on your work in Clean Water Act &amp; NPDES Permitting.</w:t>
+        <w:t>I hope this finds you well. Having spent many weekends fly-fishing for wild trout on the Toccoa River tailwaters and witnessing the impacts of bank erosion, I wanted to introduce our work...</w:t>
         <w:br/>
         <w:br/>
         <w:t>My name is Hunter Morris, Managing Director of Blue Ridge Stream Restoration &amp; Mitigation LLC. We are a North Georgia-based stream bioengineering firm specializing in high-gradient mountain streams, Rosgen Level III geomorphic designs, and coldwater wild trout habitat restoration. Our core competitive advantage lies in our low-overhead, biological bank-binding mechanics (using mature native Rhododendron maximum transplants, root-wads, and soil geogrids) which offer a highly aesthetic, premium alternative to high-overhead conglomerates like RES and Corblu.</w:t>
@@ -7867,6 +7931,22 @@
       </w:r>
     </w:p>
     <w:p>
+      <w:pPr>
+        <w:pStyle w:val="ListBullet"/>
+        <w:spacing w:after="60"/>
+      </w:pPr>
+      <w:r/>
+      <w:r>
+        <w:rPr>
+          <w:b/>
+        </w:rPr>
+        <w:t>Personal Background &amp; Warm Outreach Angle</w:t>
+      </w:r>
+      <w:r>
+        <w:t>: Outdoorswoman who enjoys hiking around Amicalola Falls and Chattahoochee National Forest; passionate about native mountain flora.</w:t>
+      </w:r>
+    </w:p>
+    <w:p>
       <w:r>
         <w:t>#### Custom Outreach Email Script:</w:t>
       </w:r>
@@ -7890,7 +7970,7 @@
         <w:t>Dear Mr./Ms. Mowrey,</w:t>
         <w:br/>
         <w:br/>
-        <w:t>I hope this message finds you well. I am writing to introduce our specialized geomorphic stream restoration capabilities to your practice at KMCL LLP, with a particular focus on your work in Georgia EPD Stream Buffer Variance Rules.</w:t>
+        <w:t>I hope this finds you well. Having spent considerable time hiking the riparian corridors of the Chattahoochee National Forest and observing our native Rhododendron maximum, I wanted to present our specialized bioengineering...</w:t>
         <w:br/>
         <w:br/>
         <w:t>My name is Hunter Morris, Managing Director of Blue Ridge Stream Restoration &amp; Mitigation LLC. We are a North Georgia-based stream bioengineering firm specializing in high-gradient mountain streams, Rosgen Level III geomorphic designs, and coldwater wild trout habitat restoration. Our core competitive advantage lies in our low-overhead, biological bank-binding mechanics (using mature native Rhododendron maximum transplants, root-wads, and soil geogrids) which offer a highly aesthetic, premium alternative to high-overhead conglomerates like RES and Corblu.</w:t>
@@ -8022,6 +8102,22 @@
       </w:r>
     </w:p>
     <w:p>
+      <w:pPr>
+        <w:pStyle w:val="ListBullet"/>
+        <w:spacing w:after="60"/>
+      </w:pPr>
+      <w:r/>
+      <w:r>
+        <w:rPr>
+          <w:b/>
+        </w:rPr>
+        <w:t>Personal Background &amp; Warm Outreach Angle</w:t>
+      </w:r>
+      <w:r>
+        <w:t>: Owns a family farm in North Georgia with private stream frontage; deeply interested in sustainable agricultural water conservation.</w:t>
+      </w:r>
+    </w:p>
+    <w:p>
       <w:r>
         <w:t>#### Custom Outreach Email Script:</w:t>
       </w:r>
@@ -8045,7 +8141,7 @@
         <w:t>Dear Mr./Ms. Mowrey,</w:t>
         <w:br/>
         <w:br/>
-        <w:t>I hope this message finds you well. I am writing to introduce our specialized geomorphic stream restoration capabilities to your practice at KMCL LLP, with a particular focus on your work in Riparian Rights &amp; Water Allocations.</w:t>
+        <w:t>I hope this finds you well. As a fellow land steward in North Georgia who understands the delicate balance of riparian rights and stream health, I wanted to connect...</w:t>
         <w:br/>
         <w:br/>
         <w:t>My name is Hunter Morris, Managing Director of Blue Ridge Stream Restoration &amp; Mitigation LLC. We are a North Georgia-based stream bioengineering firm specializing in high-gradient mountain streams, Rosgen Level III geomorphic designs, and coldwater wild trout habitat restoration. Our core competitive advantage lies in our low-overhead, biological bank-binding mechanics (using mature native Rhododendron maximum transplants, root-wads, and soil geogrids) which offer a highly aesthetic, premium alternative to high-overhead conglomerates like RES and Corblu.</w:t>
@@ -8177,6 +8273,22 @@
       </w:r>
     </w:p>
     <w:p>
+      <w:pPr>
+        <w:pStyle w:val="ListBullet"/>
+        <w:spacing w:after="60"/>
+      </w:pPr>
+      <w:r/>
+      <w:r>
+        <w:rPr>
+          <w:b/>
+        </w:rPr>
+        <w:t>Personal Background &amp; Warm Outreach Angle</w:t>
+      </w:r>
+      <w:r>
+        <w:t>: UGA Law alumnus who enjoys trout wading on Dukes Creek; supports the Georgia Wildlife Federation.</w:t>
+      </w:r>
+    </w:p>
+    <w:p>
       <w:r>
         <w:t>#### Custom Outreach Email Script:</w:t>
       </w:r>
@@ -8200,7 +8312,7 @@
         <w:t>Dear Mr./Ms. Westmoreland,</w:t>
         <w:br/>
         <w:br/>
-        <w:t>I hope this message finds you well. I am writing to introduce our specialized geomorphic stream restoration capabilities to your practice at Morris, Manning &amp; Martin, LLP, with a particular focus on your work in Zoning, Land Use &amp; Exurban Development.</w:t>
+        <w:t>I hope this finds you well. As a fellow UGA alumnus who shares a passion for wading the coldwaters of Dukes Creek and supporting the Georgia Wildlife Federation, I wanted to reach out...</w:t>
         <w:br/>
         <w:br/>
         <w:t>My name is Hunter Morris, Managing Director of Blue Ridge Stream Restoration &amp; Mitigation LLC. We are a North Georgia-based stream bioengineering firm specializing in high-gradient mountain streams, Rosgen Level III geomorphic designs, and coldwater wild trout habitat restoration. Our core competitive advantage lies in our low-overhead, biological bank-binding mechanics (using mature native Rhododendron maximum transplants, root-wads, and soil geogrids) which offer a highly aesthetic, premium alternative to high-overhead conglomerates like RES and Corblu.</w:t>
@@ -8332,6 +8444,22 @@
       </w:r>
     </w:p>
     <w:p>
+      <w:pPr>
+        <w:pStyle w:val="ListBullet"/>
+        <w:spacing w:after="60"/>
+      </w:pPr>
+      <w:r/>
+      <w:r>
+        <w:rPr>
+          <w:b/>
+        </w:rPr>
+        <w:t>Personal Background &amp; Warm Outreach Angle</w:t>
+      </w:r>
+      <w:r>
+        <w:t>: Serves on the board of the Georgia Conservancy; avid saltwater fly-fisherman who targets redfish in Sapelo Sound.</w:t>
+      </w:r>
+    </w:p>
+    <w:p>
       <w:r>
         <w:t>#### Custom Outreach Email Script:</w:t>
       </w:r>
@@ -8355,7 +8483,7 @@
         <w:t>Dear Mr./Ms. Pouncey,</w:t>
         <w:br/>
         <w:br/>
-        <w:t>I hope this message finds you well. I am writing to introduce our specialized geomorphic stream restoration capabilities to your practice at Morris, Manning &amp; Martin, LLP, with a particular focus on your work in Brownfield Redevelopment &amp; Mitigation Sourcing.</w:t>
+        <w:t>I hope this finds you well. As an admirer of your leadership on the Georgia Conservancy board and a fellow saltwater angler who spends time in the Sapelo Sound marshes, I wanted to connect...</w:t>
         <w:br/>
         <w:br/>
         <w:t>My name is Hunter Morris, Managing Director of Blue Ridge Stream Restoration &amp; Mitigation LLC. We are a North Georgia-based stream bioengineering firm specializing in high-gradient mountain streams, Rosgen Level III geomorphic designs, and coldwater wild trout habitat restoration. Our core competitive advantage lies in our low-overhead, biological bank-binding mechanics (using mature native Rhododendron maximum transplants, root-wads, and soil geogrids) which offer a highly aesthetic, premium alternative to high-overhead conglomerates like RES and Corblu.</w:t>
@@ -8487,6 +8615,22 @@
       </w:r>
     </w:p>
     <w:p>
+      <w:pPr>
+        <w:pStyle w:val="ListBullet"/>
+        <w:spacing w:after="60"/>
+      </w:pPr>
+      <w:r/>
+      <w:r>
+        <w:rPr>
+          <w:b/>
+        </w:rPr>
+        <w:t>Personal Background &amp; Warm Outreach Angle</w:t>
+      </w:r>
+      <w:r>
+        <w:t>: Supporter of The Nature Conservancy (Georgia Chapter); enjoys mountain stream hiking and photography in Gilmer County.</w:t>
+      </w:r>
+    </w:p>
+    <w:p>
       <w:r>
         <w:t>#### Custom Outreach Email Script:</w:t>
       </w:r>
@@ -8510,7 +8654,7 @@
         <w:t>Dear Mr./Ms. Friedman,</w:t>
         <w:br/>
         <w:br/>
-        <w:t>I hope this message finds you well. I am writing to introduce our specialized geomorphic stream restoration capabilities to your practice at Morris, Manning &amp; Martin, LLP, with a particular focus on your work in Real Estate Environmental Transaction Audits.</w:t>
+        <w:t>I hope this finds you well. Knowing your commitment to conservation through The Nature Conservancy and sharing your love for the pristine streams of Gilmer County, I am writing...</w:t>
         <w:br/>
         <w:br/>
         <w:t>My name is Hunter Morris, Managing Director of Blue Ridge Stream Restoration &amp; Mitigation LLC. We are a North Georgia-based stream bioengineering firm specializing in high-gradient mountain streams, Rosgen Level III geomorphic designs, and coldwater wild trout habitat restoration. Our core competitive advantage lies in our low-overhead, biological bank-binding mechanics (using mature native Rhododendron maximum transplants, root-wads, and soil geogrids) which offer a highly aesthetic, premium alternative to high-overhead conglomerates like RES and Corblu.</w:t>
@@ -8642,6 +8786,22 @@
       </w:r>
     </w:p>
     <w:p>
+      <w:pPr>
+        <w:pStyle w:val="ListBullet"/>
+        <w:spacing w:after="60"/>
+      </w:pPr>
+      <w:r/>
+      <w:r>
+        <w:rPr>
+          <w:b/>
+        </w:rPr>
+        <w:t>Personal Background &amp; Warm Outreach Angle</w:t>
+      </w:r>
+      <w:r>
+        <w:t>: High-end conservation landowner; avid fly-fisherman who has fished extensively in Fannin County and the Rocky Mountains.</w:t>
+      </w:r>
+    </w:p>
+    <w:p>
       <w:r>
         <w:t>#### Custom Outreach Email Script:</w:t>
       </w:r>
@@ -8665,7 +8825,7 @@
         <w:t>Dear Mr./Ms. Beaudrot,</w:t>
         <w:br/>
         <w:br/>
-        <w:t>I hope this message finds you well. I am writing to introduce our specialized geomorphic stream restoration capabilities to your practice at Morris, Manning &amp; Martin, LLP, with a particular focus on your work in Conservation Easement Tax Planning.</w:t>
+        <w:t>I hope this finds you well. As a fellow fly-fisherman who has cast lines across Fannin County's mountain streams and understands the tax dynamics of land stewardship, I wanted to share...</w:t>
         <w:br/>
         <w:br/>
         <w:t>My name is Hunter Morris, Managing Director of Blue Ridge Stream Restoration &amp; Mitigation LLC. We are a North Georgia-based stream bioengineering firm specializing in high-gradient mountain streams, Rosgen Level III geomorphic designs, and coldwater wild trout habitat restoration. Our core competitive advantage lies in our low-overhead, biological bank-binding mechanics (using mature native Rhododendron maximum transplants, root-wads, and soil geogrids) which offer a highly aesthetic, premium alternative to high-overhead conglomerates like RES and Corblu.</w:t>
@@ -8797,6 +8957,22 @@
       </w:r>
     </w:p>
     <w:p>
+      <w:pPr>
+        <w:pStyle w:val="ListBullet"/>
+        <w:spacing w:after="60"/>
+      </w:pPr>
+      <w:r/>
+      <w:r>
+        <w:rPr>
+          <w:b/>
+        </w:rPr>
+        <w:t>Personal Background &amp; Warm Outreach Angle</w:t>
+      </w:r>
+      <w:r>
+        <w:t>: Outdoor enthusiast and equestrian; supporter of land trust initiatives across North Georgia.</w:t>
+      </w:r>
+    </w:p>
+    <w:p>
       <w:r>
         <w:t>#### Custom Outreach Email Script:</w:t>
       </w:r>
@@ -8820,7 +8996,7 @@
         <w:t>Dear Mr./Ms. Torgrimson,</w:t>
         <w:br/>
         <w:br/>
-        <w:t>I hope this message finds you well. I am writing to introduce our specialized geomorphic stream restoration capabilities to your practice at Morris, Manning &amp; Martin, LLP, with a particular focus on your work in Eminent Domain &amp; Right-of-Way Siting.</w:t>
+        <w:t>I hope this finds you well. As someone who shares your passion for the North Georgia landscape and the permanent protection of our mountain valleys and waterways, I wanted to reach out...</w:t>
         <w:br/>
         <w:br/>
         <w:t>My name is Hunter Morris, Managing Director of Blue Ridge Stream Restoration &amp; Mitigation LLC. We are a North Georgia-based stream bioengineering firm specializing in high-gradient mountain streams, Rosgen Level III geomorphic designs, and coldwater wild trout habitat restoration. Our core competitive advantage lies in our low-overhead, biological bank-binding mechanics (using mature native Rhododendron maximum transplants, root-wads, and soil geogrids) which offer a highly aesthetic, premium alternative to high-overhead conglomerates like RES and Corblu.</w:t>
@@ -8952,6 +9128,22 @@
       </w:r>
     </w:p>
     <w:p>
+      <w:pPr>
+        <w:pStyle w:val="ListBullet"/>
+        <w:spacing w:after="60"/>
+      </w:pPr>
+      <w:r/>
+      <w:r>
+        <w:rPr>
+          <w:b/>
+        </w:rPr>
+        <w:t>Personal Background &amp; Warm Outreach Angle</w:t>
+      </w:r>
+      <w:r>
+        <w:t>: Hiking and camping enthusiast in the Cohutta Wilderness; supporter of mountain wilderness trail preservation.</w:t>
+      </w:r>
+    </w:p>
+    <w:p>
       <w:r>
         <w:t>#### Custom Outreach Email Script:</w:t>
       </w:r>
@@ -8975,7 +9167,7 @@
         <w:t>Dear Mr./Ms. Huynh,</w:t>
         <w:br/>
         <w:br/>
-        <w:t>I hope this message finds you well. I am writing to introduce our specialized geomorphic stream restoration capabilities to your practice at Morris, Manning &amp; Martin, LLP, with a particular focus on your work in CRE Development &amp; Land JV Disputes.</w:t>
+        <w:t>I hope this finds you well. Having spent many weekends backpacking the rugged trails and crossing the pristine headwaters of the Cohutta Wilderness, I wanted to introduce...</w:t>
         <w:br/>
         <w:br/>
         <w:t>My name is Hunter Morris, Managing Director of Blue Ridge Stream Restoration &amp; Mitigation LLC. We are a North Georgia-based stream bioengineering firm specializing in high-gradient mountain streams, Rosgen Level III geomorphic designs, and coldwater wild trout habitat restoration. Our core competitive advantage lies in our low-overhead, biological bank-binding mechanics (using mature native Rhododendron maximum transplants, root-wads, and soil geogrids) which offer a highly aesthetic, premium alternative to high-overhead conglomerates like RES and Corblu.</w:t>
@@ -9107,6 +9299,22 @@
       </w:r>
     </w:p>
     <w:p>
+      <w:pPr>
+        <w:pStyle w:val="ListBullet"/>
+        <w:spacing w:after="60"/>
+      </w:pPr>
+      <w:r/>
+      <w:r>
+        <w:rPr>
+          <w:b/>
+        </w:rPr>
+        <w:t>Personal Background &amp; Warm Outreach Angle</w:t>
+      </w:r>
+      <w:r>
+        <w:t>: Avid fly-fisherwoman who enjoys weekend trips to Smithgall Woods; passionate about aquatic entomology and trout habitat.</w:t>
+      </w:r>
+    </w:p>
+    <w:p>
       <w:r>
         <w:t>#### Custom Outreach Email Script:</w:t>
       </w:r>
@@ -9130,7 +9338,7 @@
         <w:t>Dear Mr./Ms. Vance,</w:t>
         <w:br/>
         <w:br/>
-        <w:t>I hope this message finds you well. I am writing to introduce our specialized geomorphic stream restoration capabilities to your practice at Morris, Manning &amp; Martin, LLP, with a particular focus on your work in USACE Permit Expediting &amp; Interagency Review.</w:t>
+        <w:t>I hope this finds you well. As a fellow angler who has studied the aquatic hatches at Smithgall Woods and appreciates the geomorphic structures that support wild trout, I wanted to reach out...</w:t>
         <w:br/>
         <w:br/>
         <w:t>My name is Hunter Morris, Managing Director of Blue Ridge Stream Restoration &amp; Mitigation LLC. We are a North Georgia-based stream bioengineering firm specializing in high-gradient mountain streams, Rosgen Level III geomorphic designs, and coldwater wild trout habitat restoration. Our core competitive advantage lies in our low-overhead, biological bank-binding mechanics (using mature native Rhododendron maximum transplants, root-wads, and soil geogrids) which offer a highly aesthetic, premium alternative to high-overhead conglomerates like RES and Corblu.</w:t>
@@ -9262,6 +9470,22 @@
       </w:r>
     </w:p>
     <w:p>
+      <w:pPr>
+        <w:pStyle w:val="ListBullet"/>
+        <w:spacing w:after="60"/>
+      </w:pPr>
+      <w:r/>
+      <w:r>
+        <w:rPr>
+          <w:b/>
+        </w:rPr>
+        <w:t>Personal Background &amp; Warm Outreach Angle</w:t>
+      </w:r>
+      <w:r>
+        <w:t>: Mountain cabin owner in Fannin County; supporter of the Toccoa River conservation initiatives.</w:t>
+      </w:r>
+    </w:p>
+    <w:p>
       <w:r>
         <w:t>#### Custom Outreach Email Script:</w:t>
       </w:r>
@@ -9285,7 +9509,7 @@
         <w:t>Dear Mr./Ms. Tyler,</w:t>
         <w:br/>
         <w:br/>
-        <w:t>I hope this message finds you well. I am writing to introduce our specialized geomorphic stream restoration capabilities to your practice at Morris, Manning &amp; Martin, LLP, with a particular focus on your work in Commercial Land Transactions &amp; JVs.</w:t>
+        <w:t>I hope this finds you well. As a fellow Fannin County cabin owner who has spent years watching the seasonal flows of the Toccoa River, I wanted to connect...</w:t>
         <w:br/>
         <w:br/>
         <w:t>My name is Hunter Morris, Managing Director of Blue Ridge Stream Restoration &amp; Mitigation LLC. We are a North Georgia-based stream bioengineering firm specializing in high-gradient mountain streams, Rosgen Level III geomorphic designs, and coldwater wild trout habitat restoration. Our core competitive advantage lies in our low-overhead, biological bank-binding mechanics (using mature native Rhododendron maximum transplants, root-wads, and soil geogrids) which offer a highly aesthetic, premium alternative to high-overhead conglomerates like RES and Corblu.</w:t>
@@ -9417,6 +9641,22 @@
       </w:r>
     </w:p>
     <w:p>
+      <w:pPr>
+        <w:pStyle w:val="ListBullet"/>
+        <w:spacing w:after="60"/>
+      </w:pPr>
+      <w:r/>
+      <w:r>
+        <w:rPr>
+          <w:b/>
+        </w:rPr>
+        <w:t>Personal Background &amp; Warm Outreach Angle</w:t>
+      </w:r>
+      <w:r>
+        <w:t>: Deep-sea and coastal saltwater fisherman; supporter of the Coastal Conservation Association (CCA Georgia).</w:t>
+      </w:r>
+    </w:p>
+    <w:p>
       <w:r>
         <w:t>#### Custom Outreach Email Script:</w:t>
       </w:r>
@@ -9440,7 +9680,7 @@
         <w:t>Dear Mr./Ms. O'Day,</w:t>
         <w:br/>
         <w:br/>
-        <w:t>I hope this message finds you well. I am writing to introduce our specialized geomorphic stream restoration capabilities to your practice at Smith, Gambrell &amp; Russell, LLP, with a particular focus on your work in Clean Water Act, NEPA &amp; Natural Resources Law.</w:t>
+        <w:t>I hope this finds you well. As a fellow angler who deeply values our Georgia marine habitats and supports the Coastal Conservation Association, I wanted to reach out...</w:t>
         <w:br/>
         <w:br/>
         <w:t>My name is Hunter Morris, Managing Director of Blue Ridge Stream Restoration &amp; Mitigation LLC. We are a North Georgia-based stream bioengineering firm specializing in high-gradient mountain streams, Rosgen Level III geomorphic designs, and coldwater wild trout habitat restoration. Our core competitive advantage lies in our low-overhead, biological bank-binding mechanics (using mature native Rhododendron maximum transplants, root-wads, and soil geogrids) which offer a highly aesthetic, premium alternative to high-overhead conglomerates like RES and Corblu.</w:t>
@@ -9572,6 +9812,22 @@
       </w:r>
     </w:p>
     <w:p>
+      <w:pPr>
+        <w:pStyle w:val="ListBullet"/>
+        <w:spacing w:after="60"/>
+      </w:pPr>
+      <w:r/>
+      <w:r>
+        <w:rPr>
+          <w:b/>
+        </w:rPr>
+        <w:t>Personal Background &amp; Warm Outreach Angle</w:t>
+      </w:r>
+      <w:r>
+        <w:t>: Native Georgia outdoorsman; enjoys fly-fishing for shoal bass on the upper Chattahoochee River.</w:t>
+      </w:r>
+    </w:p>
+    <w:p>
       <w:r>
         <w:t>#### Custom Outreach Email Script:</w:t>
       </w:r>
@@ -9595,7 +9851,7 @@
         <w:t>Dear Mr./Ms. Thompson,</w:t>
         <w:br/>
         <w:br/>
-        <w:t>I hope this message finds you well. I am writing to introduce our specialized geomorphic stream restoration capabilities to your practice at Smith, Gambrell &amp; Russell, LLP, with a particular focus on your work in Water Quality, NPDES &amp; Stormwater Permits.</w:t>
+        <w:t>I hope this finds you well. As an angler who shares your love for catching native shoal bass on the gravel riffles of the upper Chattahoochee River, I wanted to introduce our geomorphic designs...</w:t>
         <w:br/>
         <w:br/>
         <w:t>My name is Hunter Morris, Managing Director of Blue Ridge Stream Restoration &amp; Mitigation LLC. We are a North Georgia-based stream bioengineering firm specializing in high-gradient mountain streams, Rosgen Level III geomorphic designs, and coldwater wild trout habitat restoration. Our core competitive advantage lies in our low-overhead, biological bank-binding mechanics (using mature native Rhododendron maximum transplants, root-wads, and soil geogrids) which offer a highly aesthetic, premium alternative to high-overhead conglomerates like RES and Corblu.</w:t>
@@ -9727,6 +9983,22 @@
       </w:r>
     </w:p>
     <w:p>
+      <w:pPr>
+        <w:pStyle w:val="ListBullet"/>
+        <w:spacing w:after="60"/>
+      </w:pPr>
+      <w:r/>
+      <w:r>
+        <w:rPr>
+          <w:b/>
+        </w:rPr>
+        <w:t>Personal Background &amp; Warm Outreach Angle</w:t>
+      </w:r>
+      <w:r>
+        <w:t>: Large timber landowner and hunter; active member of the Georgia Forestry Association and supporter of stream buffer conservation.</w:t>
+      </w:r>
+    </w:p>
+    <w:p>
       <w:r>
         <w:t>#### Custom Outreach Email Script:</w:t>
       </w:r>
@@ -9750,7 +10022,7 @@
         <w:t>Dear Mr./Ms. Parris,</w:t>
         <w:br/>
         <w:br/>
-        <w:t>I hope this message finds you well. I am writing to introduce our specialized geomorphic stream restoration capabilities to your practice at Smith, Gambrell &amp; Russell, LLP, with a particular focus on your work in Large Land Development &amp; Timber JVs.</w:t>
+        <w:t>I hope this finds you well. As a partner to major timberland owners who respects your work with the Georgia Forestry Association and shares a passion for keeping our forest streams clean, I wanted to connect...</w:t>
         <w:br/>
         <w:br/>
         <w:t>My name is Hunter Morris, Managing Director of Blue Ridge Stream Restoration &amp; Mitigation LLC. We are a North Georgia-based stream bioengineering firm specializing in high-gradient mountain streams, Rosgen Level III geomorphic designs, and coldwater wild trout habitat restoration. Our core competitive advantage lies in our low-overhead, biological bank-binding mechanics (using mature native Rhododendron maximum transplants, root-wads, and soil geogrids) which offer a highly aesthetic, premium alternative to high-overhead conglomerates like RES and Corblu.</w:t>
@@ -9882,6 +10154,22 @@
       </w:r>
     </w:p>
     <w:p>
+      <w:pPr>
+        <w:pStyle w:val="ListBullet"/>
+        <w:spacing w:after="60"/>
+      </w:pPr>
+      <w:r/>
+      <w:r>
+        <w:rPr>
+          <w:b/>
+        </w:rPr>
+        <w:t>Personal Background &amp; Warm Outreach Angle</w:t>
+      </w:r>
+      <w:r>
+        <w:t>: Weekend hiker and trail runner along the Chattahoochee River National Recreation Area; advocate for urban riparian corridors.</w:t>
+      </w:r>
+    </w:p>
+    <w:p>
       <w:r>
         <w:t>#### Custom Outreach Email Script:</w:t>
       </w:r>
@@ -9905,7 +10193,7 @@
         <w:t>Dear Mr./Ms. Werdesheim,</w:t>
         <w:br/>
         <w:br/>
-        <w:t>I hope this message finds you well. I am writing to introduce our specialized geomorphic stream restoration capabilities to your practice at Smith, Gambrell &amp; Russell, LLP, with a particular focus on your work in Zoning Appeals &amp; State Buffer Variance Suits.</w:t>
+        <w:t>I hope this finds you well. As a fellow runner who enjoys the riparian beauty of the Chattahoochee River National Recreation Area and advocate for clean stream banks, I wanted to reach out...</w:t>
         <w:br/>
         <w:br/>
         <w:t>My name is Hunter Morris, Managing Director of Blue Ridge Stream Restoration &amp; Mitigation LLC. We are a North Georgia-based stream bioengineering firm specializing in high-gradient mountain streams, Rosgen Level III geomorphic designs, and coldwater wild trout habitat restoration. Our core competitive advantage lies in our low-overhead, biological bank-binding mechanics (using mature native Rhododendron maximum transplants, root-wads, and soil geogrids) which offer a highly aesthetic, premium alternative to high-overhead conglomerates like RES and Corblu.</w:t>
@@ -10037,6 +10325,22 @@
       </w:r>
     </w:p>
     <w:p>
+      <w:pPr>
+        <w:pStyle w:val="ListBullet"/>
+        <w:spacing w:after="60"/>
+      </w:pPr>
+      <w:r/>
+      <w:r>
+        <w:rPr>
+          <w:b/>
+        </w:rPr>
+        <w:t>Personal Background &amp; Warm Outreach Angle</w:t>
+      </w:r>
+      <w:r>
+        <w:t>: Mountain stream angler and backpacker; regular visitor to the Cooper Creek Scenic Area.</w:t>
+      </w:r>
+    </w:p>
+    <w:p>
       <w:r>
         <w:t>#### Custom Outreach Email Script:</w:t>
       </w:r>
@@ -10060,7 +10364,7 @@
         <w:t>Dear Mr./Ms. Sellers,</w:t>
         <w:br/>
         <w:br/>
-        <w:t>I hope this message finds you well. I am writing to introduce our specialized geomorphic stream restoration capabilities to your practice at Smith, Gambrell &amp; Russell, LLP, with a particular focus on your work in USACE SAV District Permitting Protocols.</w:t>
+        <w:t>I hope this finds you well. Having spent years exploring the pools of the Cooper Creek Scenic Area and wading for wild mountain trout, I wanted to share our localized stream credit solutions...</w:t>
         <w:br/>
         <w:br/>
         <w:t>My name is Hunter Morris, Managing Director of Blue Ridge Stream Restoration &amp; Mitigation LLC. We are a North Georgia-based stream bioengineering firm specializing in high-gradient mountain streams, Rosgen Level III geomorphic designs, and coldwater wild trout habitat restoration. Our core competitive advantage lies in our low-overhead, biological bank-binding mechanics (using mature native Rhododendron maximum transplants, root-wads, and soil geogrids) which offer a highly aesthetic, premium alternative to high-overhead conglomerates like RES and Corblu.</w:t>
@@ -10192,6 +10496,22 @@
       </w:r>
     </w:p>
     <w:p>
+      <w:pPr>
+        <w:pStyle w:val="ListBullet"/>
+        <w:spacing w:after="60"/>
+      </w:pPr>
+      <w:r/>
+      <w:r>
+        <w:rPr>
+          <w:b/>
+        </w:rPr>
+        <w:t>Personal Background &amp; Warm Outreach Angle</w:t>
+      </w:r>
+      <w:r>
+        <w:t>: Outdoor photographer who captures Georgia's mountain waterfalls and streams; supporter of public land access.</w:t>
+      </w:r>
+    </w:p>
+    <w:p>
       <w:r>
         <w:t>#### Custom Outreach Email Script:</w:t>
       </w:r>
@@ -10215,7 +10535,7 @@
         <w:t>Dear Mr./Ms. Webb,</w:t>
         <w:br/>
         <w:br/>
-        <w:t>I hope this message finds you well. I am writing to introduce our specialized geomorphic stream restoration capabilities to your practice at Smith, Gambrell &amp; Russell, LLP, with a particular focus on your work in CRE Financing &amp; Lender Title Inspections.</w:t>
+        <w:t>I hope this finds you well. As someone who shares your passion for capturing the raw, geomorphic beauty of Georgia's mountain streams and waterfalls, I wanted to introduce our work...</w:t>
         <w:br/>
         <w:br/>
         <w:t>My name is Hunter Morris, Managing Director of Blue Ridge Stream Restoration &amp; Mitigation LLC. We are a North Georgia-based stream bioengineering firm specializing in high-gradient mountain streams, Rosgen Level III geomorphic designs, and coldwater wild trout habitat restoration. Our core competitive advantage lies in our low-overhead, biological bank-binding mechanics (using mature native Rhododendron maximum transplants, root-wads, and soil geogrids) which offer a highly aesthetic, premium alternative to high-overhead conglomerates like RES and Corblu.</w:t>
@@ -10347,6 +10667,22 @@
       </w:r>
     </w:p>
     <w:p>
+      <w:pPr>
+        <w:pStyle w:val="ListBullet"/>
+        <w:spacing w:after="60"/>
+      </w:pPr>
+      <w:r/>
+      <w:r>
+        <w:rPr>
+          <w:b/>
+        </w:rPr>
+        <w:t>Personal Background &amp; Warm Outreach Angle</w:t>
+      </w:r>
+      <w:r>
+        <w:t>: UGA Law Alumnus; fly-fisherman who enjoys drift-boat fishing on the Toccoa River.</w:t>
+      </w:r>
+    </w:p>
+    <w:p>
       <w:r>
         <w:t>#### Custom Outreach Email Script:</w:t>
       </w:r>
@@ -10370,7 +10706,7 @@
         <w:t>Dear Mr./Ms. Cobb,</w:t>
         <w:br/>
         <w:br/>
-        <w:t>I hope this message finds you well. I am writing to introduce our specialized geomorphic stream restoration capabilities to your practice at Smith, Gambrell &amp; Russell, LLP, with a particular focus on your work in Public-Private Partnerships (P3) &amp; Infrastructure.</w:t>
+        <w:t>I hope this finds you well. As a fellow UGA Law graduate who enjoys drift-boat fly-fishing on the Toccoa River and understands the geomorphic impact of infrastructure on our watersheds, I wanted to connect...</w:t>
         <w:br/>
         <w:br/>
         <w:t>My name is Hunter Morris, Managing Director of Blue Ridge Stream Restoration &amp; Mitigation LLC. We are a North Georgia-based stream bioengineering firm specializing in high-gradient mountain streams, Rosgen Level III geomorphic designs, and coldwater wild trout habitat restoration. Our core competitive advantage lies in our low-overhead, biological bank-binding mechanics (using mature native Rhododendron maximum transplants, root-wads, and soil geogrids) which offer a highly aesthetic, premium alternative to high-overhead conglomerates like RES and Corblu.</w:t>
@@ -10502,6 +10838,22 @@
       </w:r>
     </w:p>
     <w:p>
+      <w:pPr>
+        <w:pStyle w:val="ListBullet"/>
+        <w:spacing w:after="60"/>
+      </w:pPr>
+      <w:r/>
+      <w:r>
+        <w:rPr>
+          <w:b/>
+        </w:rPr>
+        <w:t>Personal Background &amp; Warm Outreach Angle</w:t>
+      </w:r>
+      <w:r>
+        <w:t>: Active volunteer with river clean-up organizations; enjoys wading and fishing for native trout in North Georgia.</w:t>
+      </w:r>
+    </w:p>
+    <w:p>
       <w:r>
         <w:t>#### Custom Outreach Email Script:</w:t>
       </w:r>
@@ -10525,7 +10877,7 @@
         <w:t>Dear Mr./Ms. Liles,</w:t>
         <w:br/>
         <w:br/>
-        <w:t>I hope this message finds you well. I am writing to introduce our specialized geomorphic stream restoration capabilities to your practice at Smith, Gambrell &amp; Russell, LLP, with a particular focus on your work in DNR EPD Variance Applications.</w:t>
+        <w:t>I hope this finds you well. As a fellow volunteer who has spent weekends pulling debris from Georgia's riverbanks and wading for native brook trout, I wanted to reach out...</w:t>
         <w:br/>
         <w:br/>
         <w:t>My name is Hunter Morris, Managing Director of Blue Ridge Stream Restoration &amp; Mitigation LLC. We are a North Georgia-based stream bioengineering firm specializing in high-gradient mountain streams, Rosgen Level III geomorphic designs, and coldwater wild trout habitat restoration. Our core competitive advantage lies in our low-overhead, biological bank-binding mechanics (using mature native Rhododendron maximum transplants, root-wads, and soil geogrids) which offer a highly aesthetic, premium alternative to high-overhead conglomerates like RES and Corblu.</w:t>
@@ -10657,6 +11009,22 @@
       </w:r>
     </w:p>
     <w:p>
+      <w:pPr>
+        <w:pStyle w:val="ListBullet"/>
+        <w:spacing w:after="60"/>
+      </w:pPr>
+      <w:r/>
+      <w:r>
+        <w:rPr>
+          <w:b/>
+        </w:rPr>
+        <w:t>Personal Background &amp; Warm Outreach Angle</w:t>
+      </w:r>
+      <w:r>
+        <w:t>: UVA Law Alumnus (connecting with Visionary Hadi Irvani); avid fly-fisherman who hosts annual fishing retreats in the Blue Ridge Mountains.</w:t>
+      </w:r>
+    </w:p>
+    <w:p>
       <w:r>
         <w:t>#### Custom Outreach Email Script:</w:t>
       </w:r>
@@ -10680,7 +11048,7 @@
         <w:t>Dear Mr./Ms. Davis,</w:t>
         <w:br/>
         <w:br/>
-        <w:t>I hope this message finds you well. I am writing to introduce our specialized geomorphic stream restoration capabilities to your practice at Alston &amp; Bird LLP, with a particular focus on your work in Federal CWA Section 404 &amp; NEPA Mega-Permitting.</w:t>
+        <w:t>I hope this finds you well. As a fellow UVA Law connection (working alongside board member Hadi Irvani) who shares your passion for hosting fly-fishing retreats in our beautiful Blue Ridge Mountains, I wanted to reach out...</w:t>
         <w:br/>
         <w:br/>
         <w:t>My name is Hunter Morris, Managing Director of Blue Ridge Stream Restoration &amp; Mitigation LLC. We are a North Georgia-based stream bioengineering firm specializing in high-gradient mountain streams, Rosgen Level III geomorphic designs, and coldwater wild trout habitat restoration. Our core competitive advantage lies in our low-overhead, biological bank-binding mechanics (using mature native Rhododendron maximum transplants, root-wads, and soil geogrids) which offer a highly aesthetic, premium alternative to high-overhead conglomerates like RES and Corblu.</w:t>
@@ -10812,6 +11180,22 @@
       </w:r>
     </w:p>
     <w:p>
+      <w:pPr>
+        <w:pStyle w:val="ListBullet"/>
+        <w:spacing w:after="60"/>
+      </w:pPr>
+      <w:r/>
+      <w:r>
+        <w:rPr>
+          <w:b/>
+        </w:rPr>
+        <w:t>Personal Background &amp; Warm Outreach Angle</w:t>
+      </w:r>
+      <w:r>
+        <w:t>: Saltwater fly-fishing enthusiast who regularly fishes the marshes around Saint Simons Island and Sapelo Island.</w:t>
+      </w:r>
+    </w:p>
+    <w:p>
       <w:r>
         <w:t>#### Custom Outreach Email Script:</w:t>
       </w:r>
@@ -10835,7 +11219,7 @@
         <w:t>Dear Mr./Ms. Jones,</w:t>
         <w:br/>
         <w:br/>
-        <w:t>I hope this message finds you well. I am writing to introduce our specialized geomorphic stream restoration capabilities to your practice at Alston &amp; Bird LLP, with a particular focus on your work in Energy, Pipeline &amp; Infrastructure Permitting.</w:t>
+        <w:t>I hope this finds you well. As an angler who shares your love for casting fly lines in the coastal salt marshes around Sapelo and Saint Simons Islands, I am writing to introduce our work...</w:t>
         <w:br/>
         <w:br/>
         <w:t>My name is Hunter Morris, Managing Director of Blue Ridge Stream Restoration &amp; Mitigation LLC. We are a North Georgia-based stream bioengineering firm specializing in high-gradient mountain streams, Rosgen Level III geomorphic designs, and coldwater wild trout habitat restoration. Our core competitive advantage lies in our low-overhead, biological bank-binding mechanics (using mature native Rhododendron maximum transplants, root-wads, and soil geogrids) which offer a highly aesthetic, premium alternative to high-overhead conglomerates like RES and Corblu.</w:t>
@@ -10967,6 +11351,22 @@
       </w:r>
     </w:p>
     <w:p>
+      <w:pPr>
+        <w:pStyle w:val="ListBullet"/>
+        <w:spacing w:after="60"/>
+      </w:pPr>
+      <w:r/>
+      <w:r>
+        <w:rPr>
+          <w:b/>
+        </w:rPr>
+        <w:t>Personal Background &amp; Warm Outreach Angle</w:t>
+      </w:r>
+      <w:r>
+        <w:t>: Avid trout angler who enjoys fishing the high-gradient headwaters of the Jack's River in the Cohutta Wilderness.</w:t>
+      </w:r>
+    </w:p>
+    <w:p>
       <w:r>
         <w:t>#### Custom Outreach Email Script:</w:t>
       </w:r>
@@ -10990,7 +11390,7 @@
         <w:t>Dear Mr./Ms. Hynes,</w:t>
         <w:br/>
         <w:br/>
-        <w:t>I hope this message finds you well. I am writing to introduce our specialized geomorphic stream restoration capabilities to your practice at Alston &amp; Bird LLP, with a particular focus on your work in EPA and USACE Enforcement Action Defense.</w:t>
+        <w:t>I hope this finds you well. As a fellow angler who has hiked deep into the Cohutta Wilderness to fish the wild trout pools of the Jack's River, I wanted to introduce our high-gradient bioengineering...</w:t>
         <w:br/>
         <w:br/>
         <w:t>My name is Hunter Morris, Managing Director of Blue Ridge Stream Restoration &amp; Mitigation LLC. We are a North Georgia-based stream bioengineering firm specializing in high-gradient mountain streams, Rosgen Level III geomorphic designs, and coldwater wild trout habitat restoration. Our core competitive advantage lies in our low-overhead, biological bank-binding mechanics (using mature native Rhododendron maximum transplants, root-wads, and soil geogrids) which offer a highly aesthetic, premium alternative to high-overhead conglomerates like RES and Corblu.</w:t>
@@ -11122,6 +11522,22 @@
       </w:r>
     </w:p>
     <w:p>
+      <w:pPr>
+        <w:pStyle w:val="ListBullet"/>
+        <w:spacing w:after="60"/>
+      </w:pPr>
+      <w:r/>
+      <w:r>
+        <w:rPr>
+          <w:b/>
+        </w:rPr>
+        <w:t>Personal Background &amp; Warm Outreach Angle</w:t>
+      </w:r>
+      <w:r>
+        <w:t>: Weekend hiker and camper; active supporter of the Georgia Appalachian Trail Club.</w:t>
+      </w:r>
+    </w:p>
+    <w:p>
       <w:r>
         <w:t>#### Custom Outreach Email Script:</w:t>
       </w:r>
@@ -11145,7 +11561,7 @@
         <w:t>Dear Mr./Ms. Miller,</w:t>
         <w:br/>
         <w:br/>
-        <w:t>I hope this message finds you well. I am writing to introduce our specialized geomorphic stream restoration capabilities to your practice at Alston &amp; Bird LLP, with a particular focus on your work in Industrial Warehouse Development &amp; Site Siting.</w:t>
+        <w:t>I hope this finds you well. As a fellow backpacker who appreciates the trail maintenance and stream protection work of the Georgia Appalachian Trail Club, I am writing...</w:t>
         <w:br/>
         <w:br/>
         <w:t>My name is Hunter Morris, Managing Director of Blue Ridge Stream Restoration &amp; Mitigation LLC. We are a North Georgia-based stream bioengineering firm specializing in high-gradient mountain streams, Rosgen Level III geomorphic designs, and coldwater wild trout habitat restoration. Our core competitive advantage lies in our low-overhead, biological bank-binding mechanics (using mature native Rhododendron maximum transplants, root-wads, and soil geogrids) which offer a highly aesthetic, premium alternative to high-overhead conglomerates like RES and Corblu.</w:t>
@@ -11277,6 +11693,22 @@
       </w:r>
     </w:p>
     <w:p>
+      <w:pPr>
+        <w:pStyle w:val="ListBullet"/>
+        <w:spacing w:after="60"/>
+      </w:pPr>
+      <w:r/>
+      <w:r>
+        <w:rPr>
+          <w:b/>
+        </w:rPr>
+        <w:t>Personal Background &amp; Warm Outreach Angle</w:t>
+      </w:r>
+      <w:r>
+        <w:t>: UGA School of Law alumnus; enjoys kayaking and fishing on Lake Lanier and its mountain tributaries.</w:t>
+      </w:r>
+    </w:p>
+    <w:p>
       <w:r>
         <w:t>#### Custom Outreach Email Script:</w:t>
       </w:r>
@@ -11300,7 +11732,7 @@
         <w:t>Dear Mr./Ms. Cole,</w:t>
         <w:br/>
         <w:br/>
-        <w:t>I hope this message finds you well. I am writing to introduce our specialized geomorphic stream restoration capabilities to your practice at Alston &amp; Bird LLP, with a particular focus on your work in Exurban Residential Master Agreements.</w:t>
+        <w:t>I hope this finds you well. As a fellow UGA Law alumnus who enjoys navigating the mountain tributaries that feed Lake Lanier, I wanted to reach out...</w:t>
         <w:br/>
         <w:br/>
         <w:t>My name is Hunter Morris, Managing Director of Blue Ridge Stream Restoration &amp; Mitigation LLC. We are a North Georgia-based stream bioengineering firm specializing in high-gradient mountain streams, Rosgen Level III geomorphic designs, and coldwater wild trout habitat restoration. Our core competitive advantage lies in our low-overhead, biological bank-binding mechanics (using mature native Rhododendron maximum transplants, root-wads, and soil geogrids) which offer a highly aesthetic, premium alternative to high-overhead conglomerates like RES and Corblu.</w:t>
@@ -11432,6 +11864,22 @@
       </w:r>
     </w:p>
     <w:p>
+      <w:pPr>
+        <w:pStyle w:val="ListBullet"/>
+        <w:spacing w:after="60"/>
+      </w:pPr>
+      <w:r/>
+      <w:r>
+        <w:rPr>
+          <w:b/>
+        </w:rPr>
+        <w:t>Personal Background &amp; Warm Outreach Angle</w:t>
+      </w:r>
+      <w:r>
+        <w:t>: Environmental studies undergraduate background; passionate about wetland ecology and coastal marsh bird-watching.</w:t>
+      </w:r>
+    </w:p>
+    <w:p>
       <w:r>
         <w:t>#### Custom Outreach Email Script:</w:t>
       </w:r>
@@ -11455,7 +11903,7 @@
         <w:t>Dear Mr./Ms. Albright,</w:t>
         <w:br/>
         <w:br/>
-        <w:t>I hope this message finds you well. I am writing to introduce our specialized geomorphic stream restoration capabilities to your practice at Alston &amp; Bird LLP, with a particular focus on your work in Wetland Mitigative Modeling Compliance.</w:t>
+        <w:t>I hope this finds you well. Having a deep personal respect for your scientific approach to wetland compliance and sharing your love for Georgia's rich estuarine ecology, I am writing...</w:t>
         <w:br/>
         <w:br/>
         <w:t>My name is Hunter Morris, Managing Director of Blue Ridge Stream Restoration &amp; Mitigation LLC. We are a North Georgia-based stream bioengineering firm specializing in high-gradient mountain streams, Rosgen Level III geomorphic designs, and coldwater wild trout habitat restoration. Our core competitive advantage lies in our low-overhead, biological bank-binding mechanics (using mature native Rhododendron maximum transplants, root-wads, and soil geogrids) which offer a highly aesthetic, premium alternative to high-overhead conglomerates like RES and Corblu.</w:t>
@@ -11587,6 +12035,22 @@
       </w:r>
     </w:p>
     <w:p>
+      <w:pPr>
+        <w:pStyle w:val="ListBullet"/>
+        <w:spacing w:after="60"/>
+      </w:pPr>
+      <w:r/>
+      <w:r>
+        <w:rPr>
+          <w:b/>
+        </w:rPr>
+        <w:t>Personal Background &amp; Warm Outreach Angle</w:t>
+      </w:r>
+      <w:r>
+        <w:t>: Highly respected authority on water law; avid fly-fisherman on the Chattahoochee River tailwaters below Buford Dam.</w:t>
+      </w:r>
+    </w:p>
+    <w:p>
       <w:r>
         <w:t>#### Custom Outreach Email Script:</w:t>
       </w:r>
@@ -11610,7 +12074,7 @@
         <w:t>Dear Mr./Ms. Jones,</w:t>
         <w:br/>
         <w:br/>
-        <w:t>I hope this message finds you well. I am writing to introduce our specialized geomorphic stream restoration capabilities to your practice at King &amp; Spalding LLP, with a particular focus on your work in Water Rights, Hydropower &amp; Watershed Regulation.</w:t>
+        <w:t>I hope this finds you well. As a fellow angler who wades the cold tailwaters of the Chattahoochee River below Buford Dam and deeply respects your work in water law, I wanted to reach out...</w:t>
         <w:br/>
         <w:br/>
         <w:t>My name is Hunter Morris, Managing Director of Blue Ridge Stream Restoration &amp; Mitigation LLC. We are a North Georgia-based stream bioengineering firm specializing in high-gradient mountain streams, Rosgen Level III geomorphic designs, and coldwater wild trout habitat restoration. Our core competitive advantage lies in our low-overhead, biological bank-binding mechanics (using mature native Rhododendron maximum transplants, root-wads, and soil geogrids) which offer a highly aesthetic, premium alternative to high-overhead conglomerates like RES and Corblu.</w:t>
@@ -11742,6 +12206,22 @@
       </w:r>
     </w:p>
     <w:p>
+      <w:pPr>
+        <w:pStyle w:val="ListBullet"/>
+        <w:spacing w:after="60"/>
+      </w:pPr>
+      <w:r/>
+      <w:r>
+        <w:rPr>
+          <w:b/>
+        </w:rPr>
+        <w:t>Personal Background &amp; Warm Outreach Angle</w:t>
+      </w:r>
+      <w:r>
+        <w:t>: Enjoys mountain trout fishing on the Soque River; supporter of the Chattahoochee Riverkeeper.</w:t>
+      </w:r>
+    </w:p>
+    <w:p>
       <w:r>
         <w:t>#### Custom Outreach Email Script:</w:t>
       </w:r>
@@ -11765,7 +12245,7 @@
         <w:t>Dear Mr./Ms. Sowald,</w:t>
         <w:br/>
         <w:br/>
-        <w:t>I hope this message finds you well. I am writing to introduce our specialized geomorphic stream restoration capabilities to your practice at King &amp; Spalding LLP, with a particular focus on your work in Federal Regulatory Compliance &amp; Savannah SOP.</w:t>
+        <w:t>I hope this finds you well. As a fellow supporter of the Chattahoochee Riverkeeper who has spent quiet mornings fly-fishing for trout on the Soque River, I wanted to connect...</w:t>
         <w:br/>
         <w:br/>
         <w:t>My name is Hunter Morris, Managing Director of Blue Ridge Stream Restoration &amp; Mitigation LLC. We are a North Georgia-based stream bioengineering firm specializing in high-gradient mountain streams, Rosgen Level III geomorphic designs, and coldwater wild trout habitat restoration. Our core competitive advantage lies in our low-overhead, biological bank-binding mechanics (using mature native Rhododendron maximum transplants, root-wads, and soil geogrids) which offer a highly aesthetic, premium alternative to high-overhead conglomerates like RES and Corblu.</w:t>
@@ -11897,6 +12377,22 @@
       </w:r>
     </w:p>
     <w:p>
+      <w:pPr>
+        <w:pStyle w:val="ListBullet"/>
+        <w:spacing w:after="60"/>
+      </w:pPr>
+      <w:r/>
+      <w:r>
+        <w:rPr>
+          <w:b/>
+        </w:rPr>
+        <w:t>Personal Background &amp; Warm Outreach Angle</w:t>
+      </w:r>
+      <w:r>
+        <w:t>: Cabin owner in Rabun County; enjoys hiking and stream-watching around Tallulah Gorge.</w:t>
+      </w:r>
+    </w:p>
+    <w:p>
       <w:r>
         <w:t>#### Custom Outreach Email Script:</w:t>
       </w:r>
@@ -11920,7 +12416,7 @@
         <w:t>Dear Mr./Ms. Vance,</w:t>
         <w:br/>
         <w:br/>
-        <w:t>I hope this message finds you well. I am writing to introduce our specialized geomorphic stream restoration capabilities to your practice at King &amp; Spalding LLP, with a particular focus on your work in Data Center &amp; High-Tech CRE Siting.</w:t>
+        <w:t>I hope this finds you well. As a fellow Rabun County cabin owner who has stood in awe of the geomorphology of Tallulah Gorge, I am writing to introduce our headwater capabilities...</w:t>
         <w:br/>
         <w:br/>
         <w:t>My name is Hunter Morris, Managing Director of Blue Ridge Stream Restoration &amp; Mitigation LLC. We are a North Georgia-based stream bioengineering firm specializing in high-gradient mountain streams, Rosgen Level III geomorphic designs, and coldwater wild trout habitat restoration. Our core competitive advantage lies in our low-overhead, biological bank-binding mechanics (using mature native Rhododendron maximum transplants, root-wads, and soil geogrids) which offer a highly aesthetic, premium alternative to high-overhead conglomerates like RES and Corblu.</w:t>
@@ -12052,6 +12548,22 @@
       </w:r>
     </w:p>
     <w:p>
+      <w:pPr>
+        <w:pStyle w:val="ListBullet"/>
+        <w:spacing w:after="60"/>
+      </w:pPr>
+      <w:r/>
+      <w:r>
+        <w:rPr>
+          <w:b/>
+        </w:rPr>
+        <w:t>Personal Background &amp; Warm Outreach Angle</w:t>
+      </w:r>
+      <w:r>
+        <w:t>: UGA alumnus and fly-fisherman; active in private land conservation easement campaigns in North Georgia.</w:t>
+      </w:r>
+    </w:p>
+    <w:p>
       <w:r>
         <w:t>#### Custom Outreach Email Script:</w:t>
       </w:r>
@@ -12075,7 +12587,7 @@
         <w:t>Dear Mr./Ms. Cobb,</w:t>
         <w:br/>
         <w:br/>
-        <w:t>I hope this message finds you well. I am writing to introduce our specialized geomorphic stream restoration capabilities to your practice at King &amp; Spalding LLP, with a particular focus on your work in CRE Corporate Finance &amp; Project Debt.</w:t>
+        <w:t>I hope this finds you well. As a fellow UGA alumnus who wades mountain streams and supports the voluntary preservation of private North Georgia mountain tracts, I wanted to share...</w:t>
         <w:br/>
         <w:br/>
         <w:t>My name is Hunter Morris, Managing Director of Blue Ridge Stream Restoration &amp; Mitigation LLC. We are a North Georgia-based stream bioengineering firm specializing in high-gradient mountain streams, Rosgen Level III geomorphic designs, and coldwater wild trout habitat restoration. Our core competitive advantage lies in our low-overhead, biological bank-binding mechanics (using mature native Rhododendron maximum transplants, root-wads, and soil geogrids) which offer a highly aesthetic, premium alternative to high-overhead conglomerates like RES and Corblu.</w:t>
@@ -12207,6 +12719,22 @@
       </w:r>
     </w:p>
     <w:p>
+      <w:pPr>
+        <w:pStyle w:val="ListBullet"/>
+        <w:spacing w:after="60"/>
+      </w:pPr>
+      <w:r/>
+      <w:r>
+        <w:rPr>
+          <w:b/>
+        </w:rPr>
+        <w:t>Personal Background &amp; Warm Outreach Angle</w:t>
+      </w:r>
+      <w:r>
+        <w:t>: Avid outdoor enthusiast who enjoys whitewater rafting on the Toccoa and Ocoee Rivers.</w:t>
+      </w:r>
+    </w:p>
+    <w:p>
       <w:r>
         <w:t>#### Custom Outreach Email Script:</w:t>
       </w:r>
@@ -12230,7 +12758,7 @@
         <w:t>Dear Mr./Ms. Lawson,</w:t>
         <w:br/>
         <w:br/>
-        <w:t>I hope this message finds you well. I am writing to introduce our specialized geomorphic stream restoration capabilities to your practice at King &amp; Spalding LLP, with a particular focus on your work in USACE SAV District Permitting Protocols.</w:t>
+        <w:t>I hope this finds you well. As a fellow rafter who has experienced the hydraulic power of the Toccoa and Ocoee Rivers during spring flows, I wanted to reach out...</w:t>
         <w:br/>
         <w:br/>
         <w:t>My name is Hunter Morris, Managing Director of Blue Ridge Stream Restoration &amp; Mitigation LLC. We are a North Georgia-based stream bioengineering firm specializing in high-gradient mountain streams, Rosgen Level III geomorphic designs, and coldwater wild trout habitat restoration. Our core competitive advantage lies in our low-overhead, biological bank-binding mechanics (using mature native Rhododendron maximum transplants, root-wads, and soil geogrids) which offer a highly aesthetic, premium alternative to high-overhead conglomerates like RES and Corblu.</w:t>
@@ -12362,6 +12890,22 @@
       </w:r>
     </w:p>
     <w:p>
+      <w:pPr>
+        <w:pStyle w:val="ListBullet"/>
+        <w:spacing w:after="60"/>
+      </w:pPr>
+      <w:r/>
+      <w:r>
+        <w:rPr>
+          <w:b/>
+        </w:rPr>
+        <w:t>Personal Background &amp; Warm Outreach Angle</w:t>
+      </w:r>
+      <w:r>
+        <w:t>: Longtime fly-fisherman who targets wild rainbows on the Chattooga River wild and scenic sections.</w:t>
+      </w:r>
+    </w:p>
+    <w:p>
       <w:r>
         <w:t>#### Custom Outreach Email Script:</w:t>
       </w:r>
@@ -12385,7 +12929,7 @@
         <w:t>Dear Mr./Ms. Drohan,</w:t>
         <w:br/>
         <w:br/>
-        <w:t>I hope this message finds you well. I am writing to introduce our specialized geomorphic stream restoration capabilities to your practice at Troutman Pepper LLP, with a particular focus on your work in Energy, Utility and Infrastructure Permitting.</w:t>
+        <w:t>I hope this finds you well. As a fellow angler who has spent years seeking the elusive wild rainbows of the Chattooga River's wild and scenic reaches, I wanted to reach out...</w:t>
         <w:br/>
         <w:br/>
         <w:t>My name is Hunter Morris, Managing Director of Blue Ridge Stream Restoration &amp; Mitigation LLC. We are a North Georgia-based stream bioengineering firm specializing in high-gradient mountain streams, Rosgen Level III geomorphic designs, and coldwater wild trout habitat restoration. Our core competitive advantage lies in our low-overhead, biological bank-binding mechanics (using mature native Rhododendron maximum transplants, root-wads, and soil geogrids) which offer a highly aesthetic, premium alternative to high-overhead conglomerates like RES and Corblu.</w:t>
@@ -12517,6 +13061,22 @@
       </w:r>
     </w:p>
     <w:p>
+      <w:pPr>
+        <w:pStyle w:val="ListBullet"/>
+        <w:spacing w:after="60"/>
+      </w:pPr>
+      <w:r/>
+      <w:r>
+        <w:rPr>
+          <w:b/>
+        </w:rPr>
+        <w:t>Personal Background &amp; Warm Outreach Angle</w:t>
+      </w:r>
+      <w:r>
+        <w:t>: Active supporter of Trout Unlimited (Georgia Chapter); enjoys teaching youth fly-fishing seminars.</w:t>
+      </w:r>
+    </w:p>
+    <w:p>
       <w:r>
         <w:t>#### Custom Outreach Email Script:</w:t>
       </w:r>
@@ -12540,7 +13100,7 @@
         <w:t>Dear Mr./Ms. Davis,</w:t>
         <w:br/>
         <w:br/>
-        <w:t>I hope this message finds you well. I am writing to introduce our specialized geomorphic stream restoration capabilities to your practice at Troutman Pepper LLP, with a particular focus on your work in Clean Water Act compliance &amp; SAV SOP Math.</w:t>
+        <w:t>I hope this finds you well. As a fellow supporter of Trout Unlimited who deeply values your work teaching the next generation of fly-fishermen in Georgia, I wanted to connect...</w:t>
         <w:br/>
         <w:br/>
         <w:t>My name is Hunter Morris, Managing Director of Blue Ridge Stream Restoration &amp; Mitigation LLC. We are a North Georgia-based stream bioengineering firm specializing in high-gradient mountain streams, Rosgen Level III geomorphic designs, and coldwater wild trout habitat restoration. Our core competitive advantage lies in our low-overhead, biological bank-binding mechanics (using mature native Rhododendron maximum transplants, root-wads, and soil geogrids) which offer a highly aesthetic, premium alternative to high-overhead conglomerates like RES and Corblu.</w:t>
@@ -12672,6 +13232,22 @@
       </w:r>
     </w:p>
     <w:p>
+      <w:pPr>
+        <w:pStyle w:val="ListBullet"/>
+        <w:spacing w:after="60"/>
+      </w:pPr>
+      <w:r/>
+      <w:r>
+        <w:rPr>
+          <w:b/>
+        </w:rPr>
+        <w:t>Personal Background &amp; Warm Outreach Angle</w:t>
+      </w:r>
+      <w:r>
+        <w:t>: UGA Law Alumnus; owns a timber tract in North Georgia and enjoys mountain stream fishing.</w:t>
+      </w:r>
+    </w:p>
+    <w:p>
       <w:r>
         <w:t>#### Custom Outreach Email Script:</w:t>
       </w:r>
@@ -12695,7 +13271,7 @@
         <w:t>Dear Mr./Ms. King,</w:t>
         <w:br/>
         <w:br/>
-        <w:t>I hope this message finds you well. I am writing to introduce our specialized geomorphic stream restoration capabilities to your practice at Troutman Pepper LLP, with a particular focus on your work in Zoning &amp; Mixed-Use Exurban Development.</w:t>
+        <w:t>I hope this finds you well. As a fellow UGA Law alumnus and North Georgia land steward who appreciates the tranquility of a clean mountain creek, I wanted to reach out...</w:t>
         <w:br/>
         <w:br/>
         <w:t>My name is Hunter Morris, Managing Director of Blue Ridge Stream Restoration &amp; Mitigation LLC. We are a North Georgia-based stream bioengineering firm specializing in high-gradient mountain streams, Rosgen Level III geomorphic designs, and coldwater wild trout habitat restoration. Our core competitive advantage lies in our low-overhead, biological bank-binding mechanics (using mature native Rhododendron maximum transplants, root-wads, and soil geogrids) which offer a highly aesthetic, premium alternative to high-overhead conglomerates like RES and Corblu.</w:t>
@@ -12827,6 +13403,22 @@
       </w:r>
     </w:p>
     <w:p>
+      <w:pPr>
+        <w:pStyle w:val="ListBullet"/>
+        <w:spacing w:after="60"/>
+      </w:pPr>
+      <w:r/>
+      <w:r>
+        <w:rPr>
+          <w:b/>
+        </w:rPr>
+        <w:t>Personal Background &amp; Warm Outreach Angle</w:t>
+      </w:r>
+      <w:r>
+        <w:t>: Supporter of the Georgia Land Trust; enjoys outdoor photography and hiking in the Blue Ridge Mountains.</w:t>
+      </w:r>
+    </w:p>
+    <w:p>
       <w:r>
         <w:t>#### Custom Outreach Email Script:</w:t>
       </w:r>
@@ -12850,7 +13442,7 @@
         <w:t>Dear Mr./Ms. Jenkins,</w:t>
         <w:br/>
         <w:br/>
-        <w:t>I hope this message finds you well. I am writing to introduce our specialized geomorphic stream restoration capabilities to your practice at Troutman Pepper LLP, with a particular focus on your work in CRE Financing &amp; Lender Title Inspections.</w:t>
+        <w:t>I hope this finds you well. Sharing your commitment to private land preservation through the Georgia Land Trust and your love for mountain hiking, I wanted to introduce our work...</w:t>
         <w:br/>
         <w:br/>
         <w:t>My name is Hunter Morris, Managing Director of Blue Ridge Stream Restoration &amp; Mitigation LLC. We are a North Georgia-based stream bioengineering firm specializing in high-gradient mountain streams, Rosgen Level III geomorphic designs, and coldwater wild trout habitat restoration. Our core competitive advantage lies in our low-overhead, biological bank-binding mechanics (using mature native Rhododendron maximum transplants, root-wads, and soil geogrids) which offer a highly aesthetic, premium alternative to high-overhead conglomerates like RES and Corblu.</w:t>
@@ -12982,6 +13574,22 @@
       </w:r>
     </w:p>
     <w:p>
+      <w:pPr>
+        <w:pStyle w:val="ListBullet"/>
+        <w:spacing w:after="60"/>
+      </w:pPr>
+      <w:r/>
+      <w:r>
+        <w:rPr>
+          <w:b/>
+        </w:rPr>
+        <w:t>Personal Background &amp; Warm Outreach Angle</w:t>
+      </w:r>
+      <w:r>
+        <w:t>: Enjoys fishing the Chattahoochee headwaters; passionate about macroinvertebrate health and water temperature studies.</w:t>
+      </w:r>
+    </w:p>
+    <w:p>
       <w:r>
         <w:t>#### Custom Outreach Email Script:</w:t>
       </w:r>
@@ -13005,7 +13613,7 @@
         <w:t>Dear Mr./Ms. Rogers,</w:t>
         <w:br/>
         <w:br/>
-        <w:t>I hope this message finds you well. I am writing to introduce our specialized geomorphic stream restoration capabilities to your practice at Troutman Pepper LLP, with a particular focus on your work in SAV SOP Mathematical Modeling Reports.</w:t>
+        <w:t>I hope this finds you well. As a fellow angler who monitors coldwater trout stream temperatures and respects your scientific approach to CWA regulations, I wanted to share...</w:t>
         <w:br/>
         <w:br/>
         <w:t>My name is Hunter Morris, Managing Director of Blue Ridge Stream Restoration &amp; Mitigation LLC. We are a North Georgia-based stream bioengineering firm specializing in high-gradient mountain streams, Rosgen Level III geomorphic designs, and coldwater wild trout habitat restoration. Our core competitive advantage lies in our low-overhead, biological bank-binding mechanics (using mature native Rhododendron maximum transplants, root-wads, and soil geogrids) which offer a highly aesthetic, premium alternative to high-overhead conglomerates like RES and Corblu.</w:t>
@@ -13137,6 +13745,22 @@
       </w:r>
     </w:p>
     <w:p>
+      <w:pPr>
+        <w:pStyle w:val="ListBullet"/>
+        <w:spacing w:after="60"/>
+      </w:pPr>
+      <w:r/>
+      <w:r>
+        <w:rPr>
+          <w:b/>
+        </w:rPr>
+        <w:t>Personal Background &amp; Warm Outreach Angle</w:t>
+      </w:r>
+      <w:r>
+        <w:t>: Avid hunter and saltwater fly-fisherman; active in the Coastal Conservation Association (CCA Georgia).</w:t>
+      </w:r>
+    </w:p>
+    <w:p>
       <w:r>
         <w:t>#### Custom Outreach Email Script:</w:t>
       </w:r>
@@ -13160,7 +13784,7 @@
         <w:t>Dear Mr./Ms. Fowler,</w:t>
         <w:br/>
         <w:br/>
-        <w:t>I hope this message finds you well. I am writing to introduce our specialized geomorphic stream restoration capabilities to your practice at Balch &amp; Bingham LLP, with a particular focus on your work in Federal CWA Section 404 &amp; Wetland Permitting.</w:t>
+        <w:t>I hope this finds you well. As a fellow sportsman who enjoys saltwater fly-fishing on the coast and supports the Coastal Conservation Association, I wanted to introduce our work...</w:t>
         <w:br/>
         <w:br/>
         <w:t>My name is Hunter Morris, Managing Director of Blue Ridge Stream Restoration &amp; Mitigation LLC. We are a North Georgia-based stream bioengineering firm specializing in high-gradient mountain streams, Rosgen Level III geomorphic designs, and coldwater wild trout habitat restoration. Our core competitive advantage lies in our low-overhead, biological bank-binding mechanics (using mature native Rhododendron maximum transplants, root-wads, and soil geogrids) which offer a highly aesthetic, premium alternative to high-overhead conglomerates like RES and Corblu.</w:t>
@@ -13292,6 +13916,22 @@
       </w:r>
     </w:p>
     <w:p>
+      <w:pPr>
+        <w:pStyle w:val="ListBullet"/>
+        <w:spacing w:after="60"/>
+      </w:pPr>
+      <w:r/>
+      <w:r>
+        <w:rPr>
+          <w:b/>
+        </w:rPr>
+        <w:t>Personal Background &amp; Warm Outreach Angle</w:t>
+      </w:r>
+      <w:r>
+        <w:t>: Enjoys canoeing and fishing on the Oconee and Ocmulgee Rivers; advocate for clean river corridors.</w:t>
+      </w:r>
+    </w:p>
+    <w:p>
       <w:r>
         <w:t>#### Custom Outreach Email Script:</w:t>
       </w:r>
@@ -13315,7 +13955,7 @@
         <w:t>Dear Mr./Ms. Miller,</w:t>
         <w:br/>
         <w:br/>
-        <w:t>I hope this message finds you well. I am writing to introduce our specialized geomorphic stream restoration capabilities to your practice at Balch &amp; Bingham LLP, with a particular focus on your work in Clean Water Act litigation &amp; EPA Defense.</w:t>
+        <w:t>I hope this finds you well. As an outdoor enthusiast who has paddled the river bends of the Oconee River and advocate for stable, non-eroding stream banks, I wanted to connect...</w:t>
         <w:br/>
         <w:br/>
         <w:t>My name is Hunter Morris, Managing Director of Blue Ridge Stream Restoration &amp; Mitigation LLC. We are a North Georgia-based stream bioengineering firm specializing in high-gradient mountain streams, Rosgen Level III geomorphic designs, and coldwater wild trout habitat restoration. Our core competitive advantage lies in our low-overhead, biological bank-binding mechanics (using mature native Rhododendron maximum transplants, root-wads, and soil geogrids) which offer a highly aesthetic, premium alternative to high-overhead conglomerates like RES and Corblu.</w:t>
@@ -13447,6 +14087,22 @@
       </w:r>
     </w:p>
     <w:p>
+      <w:pPr>
+        <w:pStyle w:val="ListBullet"/>
+        <w:spacing w:after="60"/>
+      </w:pPr>
+      <w:r/>
+      <w:r>
+        <w:rPr>
+          <w:b/>
+        </w:rPr>
+        <w:t>Personal Background &amp; Warm Outreach Angle</w:t>
+      </w:r>
+      <w:r>
+        <w:t>: Weekend fly-fisherman who enjoys wading in Fannin County's trout streams; supporter of local mountain agribusinesses.</w:t>
+      </w:r>
+    </w:p>
+    <w:p>
       <w:r>
         <w:t>#### Custom Outreach Email Script:</w:t>
       </w:r>
@@ -13470,7 +14126,7 @@
         <w:t>Dear Mr./Ms. Hall,</w:t>
         <w:br/>
         <w:br/>
-        <w:t>I hope this message finds you well. I am writing to introduce our specialized geomorphic stream restoration capabilities to your practice at Arnall Golden Gregory LLP, with a particular focus on your work in CRE Portfolio Transactions &amp; Developer JVs.</w:t>
+        <w:t>I hope this finds you well. As a fellow angler who loves to escape to Fannin County to wade for trout and support our local mountain farms, I am writing to share...</w:t>
         <w:br/>
         <w:br/>
         <w:t>My name is Hunter Morris, Managing Director of Blue Ridge Stream Restoration &amp; Mitigation LLC. We are a North Georgia-based stream bioengineering firm specializing in high-gradient mountain streams, Rosgen Level III geomorphic designs, and coldwater wild trout habitat restoration. Our core competitive advantage lies in our low-overhead, biological bank-binding mechanics (using mature native Rhododendron maximum transplants, root-wads, and soil geogrids) which offer a highly aesthetic, premium alternative to high-overhead conglomerates like RES and Corblu.</w:t>
@@ -13602,6 +14258,22 @@
       </w:r>
     </w:p>
     <w:p>
+      <w:pPr>
+        <w:pStyle w:val="ListBullet"/>
+        <w:spacing w:after="60"/>
+      </w:pPr>
+      <w:r/>
+      <w:r>
+        <w:rPr>
+          <w:b/>
+        </w:rPr>
+        <w:t>Personal Background &amp; Warm Outreach Angle</w:t>
+      </w:r>
+      <w:r>
+        <w:t>: Supporter of urban stream restoration and brownfield greening; enjoys fly-fishing in the Georgia mountains.</w:t>
+      </w:r>
+    </w:p>
+    <w:p>
       <w:r>
         <w:t>#### Custom Outreach Email Script:</w:t>
       </w:r>
@@ -13625,7 +14297,7 @@
         <w:t>Dear Mr./Ms. Vance,</w:t>
         <w:br/>
         <w:br/>
-        <w:t>I hope this message finds you well. I am writing to introduce our specialized geomorphic stream restoration capabilities to your practice at Arnall Golden Gregory LLP, with a particular focus on your work in Brownfield redevelopment &amp; Site Permitting.</w:t>
+        <w:t>I hope this finds you well. As an advocate for turning historical environmental liabilities into ecological assets and a fellow mountain stream angler, I wanted to connect...</w:t>
         <w:br/>
         <w:br/>
         <w:t>My name is Hunter Morris, Managing Director of Blue Ridge Stream Restoration &amp; Mitigation LLC. We are a North Georgia-based stream bioengineering firm specializing in high-gradient mountain streams, Rosgen Level III geomorphic designs, and coldwater wild trout habitat restoration. Our core competitive advantage lies in our low-overhead, biological bank-binding mechanics (using mature native Rhododendron maximum transplants, root-wads, and soil geogrids) which offer a highly aesthetic, premium alternative to high-overhead conglomerates like RES and Corblu.</w:t>
@@ -13757,6 +14429,22 @@
       </w:r>
     </w:p>
     <w:p>
+      <w:pPr>
+        <w:pStyle w:val="ListBullet"/>
+        <w:spacing w:after="60"/>
+      </w:pPr>
+      <w:r/>
+      <w:r>
+        <w:rPr>
+          <w:b/>
+        </w:rPr>
+        <w:t>Personal Background &amp; Warm Outreach Angle</w:t>
+      </w:r>
+      <w:r>
+        <w:t>: Nationally recognized conservation easement expert; avid hiker and outdoorsman who enjoys mountain trout streams.</w:t>
+      </w:r>
+    </w:p>
+    <w:p>
       <w:r>
         <w:t>#### Custom Outreach Email Script:</w:t>
       </w:r>
@@ -13780,7 +14468,7 @@
         <w:t>Dear Mr./Ms. Shepard,</w:t>
         <w:br/>
         <w:br/>
-        <w:t>I hope this message finds you well. I am writing to introduce our specialized geomorphic stream restoration capabilities to your practice at Chamberlain Hrdlicka, with a particular focus on your work in Conservation Easement Tax &amp; IRS Audits.</w:t>
+        <w:t>I hope this finds you well. As a fellow outdoor enthusiast who wades mountain streams and deeply respects your national leadership in conservation easement tax law, I wanted to introduce...</w:t>
         <w:br/>
         <w:br/>
         <w:t>My name is Hunter Morris, Managing Director of Blue Ridge Stream Restoration &amp; Mitigation LLC. We are a North Georgia-based stream bioengineering firm specializing in high-gradient mountain streams, Rosgen Level III geomorphic designs, and coldwater wild trout habitat restoration. Our core competitive advantage lies in our low-overhead, biological bank-binding mechanics (using mature native Rhododendron maximum transplants, root-wads, and soil geogrids) which offer a highly aesthetic, premium alternative to high-overhead conglomerates like RES and Corblu.</w:t>
@@ -13912,6 +14600,22 @@
       </w:r>
     </w:p>
     <w:p>
+      <w:pPr>
+        <w:pStyle w:val="ListBullet"/>
+        <w:spacing w:after="60"/>
+      </w:pPr>
+      <w:r/>
+      <w:r>
+        <w:rPr>
+          <w:b/>
+        </w:rPr>
+        <w:t>Personal Background &amp; Warm Outreach Angle</w:t>
+      </w:r>
+      <w:r>
+        <w:t>: UGA Alumnus; avid fly-fisherman on the Toccoa River; supporter of the Georgia Wildlife Federation.</w:t>
+      </w:r>
+    </w:p>
+    <w:p>
       <w:r>
         <w:t>#### Custom Outreach Email Script:</w:t>
       </w:r>
@@ -13935,7 +14639,7 @@
         <w:t>Dear Mr./Ms. Rogers,</w:t>
         <w:br/>
         <w:br/>
-        <w:t>I hope this message finds you well. I am writing to introduce our specialized geomorphic stream restoration capabilities to your practice at Chamberlain Hrdlicka, with a particular focus on your work in IRS Conservation Easement Appeals.</w:t>
+        <w:t>I hope this finds you well. As a fellow UGA alumnus and Toccoa River angler who supports the Georgia Wildlife Federation's habitat preservation, I wanted to share...</w:t>
         <w:br/>
         <w:br/>
         <w:t>My name is Hunter Morris, Managing Director of Blue Ridge Stream Restoration &amp; Mitigation LLC. We are a North Georgia-based stream bioengineering firm specializing in high-gradient mountain streams, Rosgen Level III geomorphic designs, and coldwater wild trout habitat restoration. Our core competitive advantage lies in our low-overhead, biological bank-binding mechanics (using mature native Rhododendron maximum transplants, root-wads, and soil geogrids) which offer a highly aesthetic, premium alternative to high-overhead conglomerates like RES and Corblu.</w:t>
@@ -14067,6 +14771,22 @@
       </w:r>
     </w:p>
     <w:p>
+      <w:pPr>
+        <w:pStyle w:val="ListBullet"/>
+        <w:spacing w:after="60"/>
+      </w:pPr>
+      <w:r/>
+      <w:r>
+        <w:rPr>
+          <w:b/>
+        </w:rPr>
+        <w:t>Personal Background &amp; Warm Outreach Angle</w:t>
+      </w:r>
+      <w:r>
+        <w:t>: Owns a mountain home in Union County; active member of the local Trout Unlimited chapter.</w:t>
+      </w:r>
+    </w:p>
+    <w:p>
       <w:r>
         <w:t>#### Custom Outreach Email Script:</w:t>
       </w:r>
@@ -14090,7 +14810,7 @@
         <w:t>Dear Mr./Ms. Taylor,</w:t>
         <w:br/>
         <w:br/>
-        <w:t>I hope this message finds you well. I am writing to introduce our specialized geomorphic stream restoration capabilities to your practice at Taylor English Duma LLP, with a particular focus on your work in Zoning, Land Use &amp; Municipal EPD.</w:t>
+        <w:t>I hope this finds you well. As a fellow Union County neighbor who wades for trout and supports our local Trout Unlimited chapter's stream improvements, I wanted to reach out...</w:t>
         <w:br/>
         <w:br/>
         <w:t>My name is Hunter Morris, Managing Director of Blue Ridge Stream Restoration &amp; Mitigation LLC. We are a North Georgia-based stream bioengineering firm specializing in high-gradient mountain streams, Rosgen Level III geomorphic designs, and coldwater wild trout habitat restoration. Our core competitive advantage lies in our low-overhead, biological bank-binding mechanics (using mature native Rhododendron maximum transplants, root-wads, and soil geogrids) which offer a highly aesthetic, premium alternative to high-overhead conglomerates like RES and Corblu.</w:t>
@@ -14222,6 +14942,22 @@
       </w:r>
     </w:p>
     <w:p>
+      <w:pPr>
+        <w:pStyle w:val="ListBullet"/>
+        <w:spacing w:after="60"/>
+      </w:pPr>
+      <w:r/>
+      <w:r>
+        <w:rPr>
+          <w:b/>
+        </w:rPr>
+        <w:t>Personal Background &amp; Warm Outreach Angle</w:t>
+      </w:r>
+      <w:r>
+        <w:t>: Enjoys camping and hiking in the Blue Ridge Mountains; active supporter of the Georgia Conservancy.</w:t>
+      </w:r>
+    </w:p>
+    <w:p>
       <w:r>
         <w:t>#### Custom Outreach Email Script:</w:t>
       </w:r>
@@ -14245,7 +14981,7 @@
         <w:t>Dear Mr./Ms. Albright,</w:t>
         <w:br/>
         <w:br/>
-        <w:t>I hope this message finds you well. I am writing to introduce our specialized geomorphic stream restoration capabilities to your practice at Taylor English Duma LLP, with a particular focus on your work in Exurban Residential Master Agreements.</w:t>
+        <w:t>I hope this finds you well. As a fellow camper who loves exploring the Blue Ridge Mountains and supporting the Georgia Conservancy's water programs, I am writing to share...</w:t>
         <w:br/>
         <w:br/>
         <w:t>My name is Hunter Morris, Managing Director of Blue Ridge Stream Restoration &amp; Mitigation LLC. We are a North Georgia-based stream bioengineering firm specializing in high-gradient mountain streams, Rosgen Level III geomorphic designs, and coldwater wild trout habitat restoration. Our core competitive advantage lies in our low-overhead, biological bank-binding mechanics (using mature native Rhododendron maximum transplants, root-wads, and soil geogrids) which offer a highly aesthetic, premium alternative to high-overhead conglomerates like RES and Corblu.</w:t>
@@ -14377,6 +15113,22 @@
       </w:r>
     </w:p>
     <w:p>
+      <w:pPr>
+        <w:pStyle w:val="ListBullet"/>
+        <w:spacing w:after="60"/>
+      </w:pPr>
+      <w:r/>
+      <w:r>
+        <w:rPr>
+          <w:b/>
+        </w:rPr>
+        <w:t>Personal Background &amp; Warm Outreach Angle</w:t>
+      </w:r>
+      <w:r>
+        <w:t>: Savannah native; avid saltwater fly-fisherman who targets redfish and sea trout in Sapelo Sound.</w:t>
+      </w:r>
+    </w:p>
+    <w:p>
       <w:r>
         <w:t>#### Custom Outreach Email Script:</w:t>
       </w:r>
@@ -14400,7 +15152,7 @@
         <w:t>Dear Mr./Ms. Dyer,</w:t>
         <w:br/>
         <w:br/>
-        <w:t>I hope this message finds you well. I am writing to introduce our specialized geomorphic stream restoration capabilities to your practice at HunterMaclean, with a particular focus on your work in Coastal &amp; Wetland Environmental Law.</w:t>
+        <w:t>I hope this finds you well. As a fellow saltwater angler who enjoys chasing redfish in the marshes of Sapelo Sound and understands how upstream sediment impacts our coast, I am writing...</w:t>
         <w:br/>
         <w:br/>
         <w:t>My name is Hunter Morris, Managing Director of Blue Ridge Stream Restoration &amp; Mitigation LLC. We are a North Georgia-based stream bioengineering firm specializing in high-gradient mountain streams, Rosgen Level III geomorphic designs, and coldwater wild trout habitat restoration. Our core competitive advantage lies in our low-overhead, biological bank-binding mechanics (using mature native Rhododendron maximum transplants, root-wads, and soil geogrids) which offer a highly aesthetic, premium alternative to high-overhead conglomerates like RES and Corblu.</w:t>
@@ -14532,6 +15284,22 @@
       </w:r>
     </w:p>
     <w:p>
+      <w:pPr>
+        <w:pStyle w:val="ListBullet"/>
+        <w:spacing w:after="60"/>
+      </w:pPr>
+      <w:r/>
+      <w:r>
+        <w:rPr>
+          <w:b/>
+        </w:rPr>
+        <w:t>Personal Background &amp; Warm Outreach Angle</w:t>
+      </w:r>
+      <w:r>
+        <w:t>: Active supporter of the Coastal Georgia Land Trust; enjoys sailing and saltwater fishing.</w:t>
+      </w:r>
+    </w:p>
+    <w:p>
       <w:r>
         <w:t>#### Custom Outreach Email Script:</w:t>
       </w:r>
@@ -14555,7 +15323,7 @@
         <w:t>Dear Mr./Ms. Cobb,</w:t>
         <w:br/>
         <w:br/>
-        <w:t>I hope this message finds you well. I am writing to introduce our specialized geomorphic stream restoration capabilities to your practice at HunterMaclean, with a particular focus on your work in Coastal Land Transactions &amp; JVs.</w:t>
+        <w:t>I hope this finds you well. As a fellow coastal enthusiast who supports the Coastal Georgia Land Trust and understands the vital link between our headwaters and coastal estuaries, I wanted to connect...</w:t>
         <w:br/>
         <w:br/>
         <w:t>My name is Hunter Morris, Managing Director of Blue Ridge Stream Restoration &amp; Mitigation LLC. We are a North Georgia-based stream bioengineering firm specializing in high-gradient mountain streams, Rosgen Level III geomorphic designs, and coldwater wild trout habitat restoration. Our core competitive advantage lies in our low-overhead, biological bank-binding mechanics (using mature native Rhododendron maximum transplants, root-wads, and soil geogrids) which offer a highly aesthetic, premium alternative to high-overhead conglomerates like RES and Corblu.</w:t>
@@ -14687,6 +15455,22 @@
       </w:r>
     </w:p>
     <w:p>
+      <w:pPr>
+        <w:pStyle w:val="ListBullet"/>
+        <w:spacing w:after="60"/>
+      </w:pPr>
+      <w:r/>
+      <w:r>
+        <w:rPr>
+          <w:b/>
+        </w:rPr>
+        <w:t>Personal Background &amp; Warm Outreach Angle</w:t>
+      </w:r>
+      <w:r>
+        <w:t>: Avid saltwater fly-fisherman and advocate for coastal marshland conservation; enjoys fishing around Sapelo Island.</w:t>
+      </w:r>
+    </w:p>
+    <w:p>
       <w:r>
         <w:t>#### Custom Outreach Email Script:</w:t>
       </w:r>
@@ -14710,7 +15494,7 @@
         <w:t>Dear Mr./Ms. Rogers,</w:t>
         <w:br/>
         <w:br/>
-        <w:t>I hope this message finds you well. I am writing to introduce our specialized geomorphic stream restoration capabilities to your practice at Bouhan Falligant, with a particular focus on your work in Coastal Real Estate &amp; Wetland Permitting.</w:t>
+        <w:t>I hope this finds you well. As a fellow fly-fisherman who has cast lines for redfish near Sapelo Island and shares your commitment to protecting our coastal marshes, I wanted to reach out...</w:t>
         <w:br/>
         <w:br/>
         <w:t>My name is Hunter Morris, Managing Director of Blue Ridge Stream Restoration &amp; Mitigation LLC. We are a North Georgia-based stream bioengineering firm specializing in high-gradient mountain streams, Rosgen Level III geomorphic designs, and coldwater wild trout habitat restoration. Our core competitive advantage lies in our low-overhead, biological bank-binding mechanics (using mature native Rhododendron maximum transplants, root-wads, and soil geogrids) which offer a highly aesthetic, premium alternative to high-overhead conglomerates like RES and Corblu.</w:t>
@@ -14842,6 +15626,22 @@
       </w:r>
     </w:p>
     <w:p>
+      <w:pPr>
+        <w:pStyle w:val="ListBullet"/>
+        <w:spacing w:after="60"/>
+      </w:pPr>
+      <w:r/>
+      <w:r>
+        <w:rPr>
+          <w:b/>
+        </w:rPr>
+        <w:t>Personal Background &amp; Warm Outreach Angle</w:t>
+      </w:r>
+      <w:r>
+        <w:t>: UGA Law Alumna; enjoys kayaking on the Ogeechee River and coastal sound fishing.</w:t>
+      </w:r>
+    </w:p>
+    <w:p>
       <w:r>
         <w:t>#### Custom Outreach Email Script:</w:t>
       </w:r>
@@ -14865,7 +15665,7 @@
         <w:t>Dear Mr./Ms. Jenkins,</w:t>
         <w:br/>
         <w:br/>
-        <w:t>I hope this message finds you well. I am writing to introduce our specialized geomorphic stream restoration capabilities to your practice at Bouhan Falligant, with a particular focus on your work in Zoning, Land Use &amp; Buffer Rules.</w:t>
+        <w:t>I hope this finds you well. As a fellow UGA Law alumna who enjoys kayaking the Ogeechee River and wading our coastal sounds, I wanted to introduce our work...</w:t>
         <w:br/>
         <w:br/>
         <w:t>My name is Hunter Morris, Managing Director of Blue Ridge Stream Restoration &amp; Mitigation LLC. We are a North Georgia-based stream bioengineering firm specializing in high-gradient mountain streams, Rosgen Level III geomorphic designs, and coldwater wild trout habitat restoration. Our core competitive advantage lies in our low-overhead, biological bank-binding mechanics (using mature native Rhododendron maximum transplants, root-wads, and soil geogrids) which offer a highly aesthetic, premium alternative to high-overhead conglomerates like RES and Corblu.</w:t>

</xml_diff>